<commit_message>
Cache Controller Project Verilog
</commit_message>
<xml_diff>
--- a/Cache_Controller_Project_Report.docx
+++ b/Cache_Controller_Project_Report.docx
@@ -2567,25 +2567,7 @@
           <w:sz w:val="24"/>
           <w:szCs w:val="24"/>
         </w:rPr>
-        <w:t xml:space="preserve">A cache is a small, fast storage structure placed between a processor and a larger main memory. Its purpose is to keep recently used data close to the processor so that repeated </w:t>
-      </w:r>
-      <w:proofErr w:type="gramStart"/>
-      <w:r>
-        <w:rPr>
-          <w:rFonts w:ascii="Times New Roman" w:hAnsi="Times New Roman" w:cs="Times New Roman"/>
-          <w:sz w:val="24"/>
-          <w:szCs w:val="24"/>
-        </w:rPr>
-        <w:t>accesses</w:t>
-      </w:r>
-      <w:proofErr w:type="gramEnd"/>
-      <w:r>
-        <w:rPr>
-          <w:rFonts w:ascii="Times New Roman" w:hAnsi="Times New Roman" w:cs="Times New Roman"/>
-          <w:sz w:val="24"/>
-          <w:szCs w:val="24"/>
-        </w:rPr>
-        <w:t xml:space="preserve"> can be served without repeatedly reading main memory. This project focuses on the control logic required to determine whether an address is present in the cache and what action must be taken on a hit or miss.</w:t>
+        <w:t>A cache is a small, fast storage structure placed between a processor and a larger main memory. Its purpose is to keep recently used data close to the processor so that repeated accesses can be served without repeatedly reading main memory. This project focuses on the control logic required to determine whether an address is present in the cache and what action must be taken on a hit or miss.</w:t>
       </w:r>
     </w:p>
     <w:p>
@@ -2637,25 +2619,7 @@
           <w:sz w:val="24"/>
           <w:szCs w:val="24"/>
         </w:rPr>
-        <w:t xml:space="preserve">The eight cache lines are divided into four sets, with two ways in each set. For any requested address, the index selects exactly one </w:t>
-      </w:r>
-      <w:proofErr w:type="gramStart"/>
-      <w:r>
-        <w:rPr>
-          <w:rFonts w:ascii="Times New Roman" w:hAnsi="Times New Roman" w:cs="Times New Roman"/>
-          <w:sz w:val="24"/>
-          <w:szCs w:val="24"/>
-        </w:rPr>
-        <w:t>set</w:t>
-      </w:r>
-      <w:proofErr w:type="gramEnd"/>
-      <w:r>
-        <w:rPr>
-          <w:rFonts w:ascii="Times New Roman" w:hAnsi="Times New Roman" w:cs="Times New Roman"/>
-          <w:sz w:val="24"/>
-          <w:szCs w:val="24"/>
-        </w:rPr>
-        <w:t xml:space="preserve"> and the tag is compared against both ways in that set. A match in either valid way produces a cache hit.</w:t>
+        <w:t>The eight cache lines are divided into four sets, with two ways in each set. For any requested address, the index selects exactly one set and the tag is compared against both ways in that set. A match in either valid way produces a cache hit.</w:t>
       </w:r>
     </w:p>
     <w:p>
@@ -2887,25 +2851,7 @@
                 <w:sz w:val="24"/>
                 <w:szCs w:val="24"/>
               </w:rPr>
-              <w:t xml:space="preserve">2 bits: </w:t>
-            </w:r>
-            <w:proofErr w:type="gramStart"/>
-            <w:r>
-              <w:rPr>
-                <w:rFonts w:ascii="Times New Roman" w:hAnsi="Times New Roman" w:cs="Times New Roman"/>
-                <w:sz w:val="24"/>
-                <w:szCs w:val="24"/>
-              </w:rPr>
-              <w:t>address[</w:t>
-            </w:r>
-            <w:proofErr w:type="gramEnd"/>
-            <w:r>
-              <w:rPr>
-                <w:rFonts w:ascii="Times New Roman" w:hAnsi="Times New Roman" w:cs="Times New Roman"/>
-                <w:sz w:val="24"/>
-                <w:szCs w:val="24"/>
-              </w:rPr>
-              <w:t>1:0]</w:t>
+              <w:t>2 bits: address[1:0]</w:t>
             </w:r>
           </w:p>
         </w:tc>
@@ -2958,25 +2904,7 @@
                 <w:sz w:val="24"/>
                 <w:szCs w:val="24"/>
               </w:rPr>
-              <w:t xml:space="preserve">14 bits: </w:t>
-            </w:r>
-            <w:proofErr w:type="gramStart"/>
-            <w:r>
-              <w:rPr>
-                <w:rFonts w:ascii="Times New Roman" w:hAnsi="Times New Roman" w:cs="Times New Roman"/>
-                <w:sz w:val="24"/>
-                <w:szCs w:val="24"/>
-              </w:rPr>
-              <w:t>address[</w:t>
-            </w:r>
-            <w:proofErr w:type="gramEnd"/>
-            <w:r>
-              <w:rPr>
-                <w:rFonts w:ascii="Times New Roman" w:hAnsi="Times New Roman" w:cs="Times New Roman"/>
-                <w:sz w:val="24"/>
-                <w:szCs w:val="24"/>
-              </w:rPr>
-              <w:t>15:2]</w:t>
+              <w:t>14 bits: address[15:2]</w:t>
             </w:r>
           </w:p>
         </w:tc>
@@ -3137,42 +3065,14 @@
         <w:rPr>
           <w:sz w:val="22"/>
         </w:rPr>
-        <w:t xml:space="preserve">Tag   = </w:t>
-      </w:r>
-      <w:proofErr w:type="gramStart"/>
-      <w:r>
-        <w:rPr>
-          <w:sz w:val="22"/>
-        </w:rPr>
-        <w:t>address[</w:t>
-      </w:r>
-      <w:proofErr w:type="gramEnd"/>
-      <w:r>
-        <w:rPr>
-          <w:sz w:val="22"/>
-        </w:rPr>
-        <w:t>15:2]    // 14 bits</w:t>
+        <w:t>Tag   = address[15:2]    // 14 bits</w:t>
       </w:r>
       <w:r>
         <w:rPr>
           <w:sz w:val="22"/>
         </w:rPr>
         <w:br/>
-        <w:t xml:space="preserve">Index = </w:t>
-      </w:r>
-      <w:proofErr w:type="gramStart"/>
-      <w:r>
-        <w:rPr>
-          <w:sz w:val="22"/>
-        </w:rPr>
-        <w:t>address[</w:t>
-      </w:r>
-      <w:proofErr w:type="gramEnd"/>
-      <w:r>
-        <w:rPr>
-          <w:sz w:val="22"/>
-        </w:rPr>
-        <w:t>1:0]     // 2 bits</w:t>
+        <w:t>Index = address[1:0]     // 2 bits</w:t>
       </w:r>
     </w:p>
     <w:p>
@@ -4291,25 +4191,7 @@
           <w:sz w:val="24"/>
           <w:szCs w:val="24"/>
         </w:rPr>
-        <w:t xml:space="preserve">The main memory is deliberately simple: </w:t>
-      </w:r>
-      <w:proofErr w:type="gramStart"/>
-      <w:r>
-        <w:rPr>
-          <w:rFonts w:ascii="Times New Roman" w:hAnsi="Times New Roman" w:cs="Times New Roman"/>
-          <w:sz w:val="24"/>
-          <w:szCs w:val="24"/>
-        </w:rPr>
-        <w:t>read</w:t>
-      </w:r>
-      <w:proofErr w:type="gramEnd"/>
-      <w:r>
-        <w:rPr>
-          <w:rFonts w:ascii="Times New Roman" w:hAnsi="Times New Roman" w:cs="Times New Roman"/>
-          <w:sz w:val="24"/>
-          <w:szCs w:val="24"/>
-        </w:rPr>
-        <w:t xml:space="preserve"> data is combinational, mem_ready follows mem_req, and writes occur on the rising clock edge when mem_req and mem_we are both asserted. Its simplicity keeps the focus on cache-controller behavior.</w:t>
+        <w:t>The main memory is deliberately simple: read data is combinational, mem_ready follows mem_req, and writes occur on the rising clock edge when mem_req and mem_we are both asserted. Its simplicity keeps the focus on cache-controller behavior.</w:t>
       </w:r>
     </w:p>
     <w:p>
@@ -4500,23 +4382,13 @@
                 <w:szCs w:val="24"/>
               </w:rPr>
             </w:pPr>
-            <w:proofErr w:type="gramStart"/>
-            <w:r>
-              <w:rPr>
-                <w:rFonts w:ascii="Times New Roman" w:hAnsi="Times New Roman" w:cs="Times New Roman"/>
-                <w:sz w:val="24"/>
-                <w:szCs w:val="24"/>
-              </w:rPr>
-              <w:t>Wait</w:t>
-            </w:r>
-            <w:proofErr w:type="gramEnd"/>
-            <w:r>
-              <w:rPr>
-                <w:rFonts w:ascii="Times New Roman" w:hAnsi="Times New Roman" w:cs="Times New Roman"/>
-                <w:sz w:val="24"/>
-                <w:szCs w:val="24"/>
-              </w:rPr>
-              <w:t xml:space="preserve"> for request</w:t>
+            <w:r>
+              <w:rPr>
+                <w:rFonts w:ascii="Times New Roman" w:hAnsi="Times New Roman" w:cs="Times New Roman"/>
+                <w:sz w:val="24"/>
+                <w:szCs w:val="24"/>
+              </w:rPr>
+              <w:t>Wait for request</w:t>
             </w:r>
           </w:p>
         </w:tc>
@@ -4772,25 +4644,7 @@
                 <w:sz w:val="24"/>
                 <w:szCs w:val="24"/>
               </w:rPr>
-              <w:t xml:space="preserve">When mem_ready=1, assert cpu_ready and return to IDLE. Memory </w:t>
-            </w:r>
-            <w:proofErr w:type="gramStart"/>
-            <w:r>
-              <w:rPr>
-                <w:rFonts w:ascii="Times New Roman" w:hAnsi="Times New Roman" w:cs="Times New Roman"/>
-                <w:sz w:val="24"/>
-                <w:szCs w:val="24"/>
-              </w:rPr>
-              <w:t>write</w:t>
-            </w:r>
-            <w:proofErr w:type="gramEnd"/>
-            <w:r>
-              <w:rPr>
-                <w:rFonts w:ascii="Times New Roman" w:hAnsi="Times New Roman" w:cs="Times New Roman"/>
-                <w:sz w:val="24"/>
-                <w:szCs w:val="24"/>
-              </w:rPr>
-              <w:t xml:space="preserve"> control is active while this state is selected.</w:t>
+              <w:t>When mem_ready=1, assert cpu_ready and return to IDLE. Memory write control is active while this state is selected.</w:t>
             </w:r>
           </w:p>
         </w:tc>
@@ -4981,10 +4835,8 @@
           <w:u w:val="single"/>
         </w:rPr>
       </w:pPr>
-    </w:p>
-    <w:p>
-      <w:pPr>
-        <w:pStyle w:val="Heading1"/>
+      <w:bookmarkStart w:id="27" w:name="_Toc240831299"/>
+      <w:r>
         <w:rPr>
           <w:rFonts w:ascii="Times New Roman" w:hAnsi="Times New Roman" w:cs="Times New Roman"/>
           <w:color w:val="auto"/>
@@ -4992,16 +4844,7 @@
           <w:highlight w:val="lightGray"/>
           <w:u w:val="single"/>
         </w:rPr>
-      </w:pPr>
-      <w:bookmarkStart w:id="27" w:name="_Toc240831299"/>
-      <w:r>
-        <w:rPr>
-          <w:rFonts w:ascii="Times New Roman" w:hAnsi="Times New Roman" w:cs="Times New Roman"/>
-          <w:color w:val="auto"/>
-          <w:szCs w:val="32"/>
-          <w:highlight w:val="lightGray"/>
-          <w:u w:val="single"/>
-        </w:rPr>
+        <w:lastRenderedPageBreak/>
         <w:t>6. CACHE OPERATIONS AND POLICY IMPLEMENTATION</w:t>
       </w:r>
       <w:bookmarkEnd w:id="27"/>
@@ -5149,25 +4992,7 @@
                 <w:sz w:val="24"/>
                 <w:szCs w:val="24"/>
               </w:rPr>
-              <w:t xml:space="preserve">Requested tag </w:t>
-            </w:r>
-            <w:proofErr w:type="gramStart"/>
-            <w:r>
-              <w:rPr>
-                <w:rFonts w:ascii="Times New Roman" w:hAnsi="Times New Roman" w:cs="Times New Roman"/>
-                <w:sz w:val="24"/>
-                <w:szCs w:val="24"/>
-              </w:rPr>
-              <w:t>matches</w:t>
-            </w:r>
-            <w:proofErr w:type="gramEnd"/>
-            <w:r>
-              <w:rPr>
-                <w:rFonts w:ascii="Times New Roman" w:hAnsi="Times New Roman" w:cs="Times New Roman"/>
-                <w:sz w:val="24"/>
-                <w:szCs w:val="24"/>
-              </w:rPr>
-              <w:t xml:space="preserve"> a valid way.</w:t>
+              <w:t>Requested tag matches a valid way.</w:t>
             </w:r>
           </w:p>
         </w:tc>
@@ -5268,25 +5093,7 @@
                 <w:sz w:val="24"/>
                 <w:szCs w:val="24"/>
               </w:rPr>
-              <w:t xml:space="preserve">Enter MEM_READ, fetch from memory, </w:t>
-            </w:r>
-            <w:proofErr w:type="gramStart"/>
-            <w:r>
-              <w:rPr>
-                <w:rFonts w:ascii="Times New Roman" w:hAnsi="Times New Roman" w:cs="Times New Roman"/>
-                <w:sz w:val="24"/>
-                <w:szCs w:val="24"/>
-              </w:rPr>
-              <w:t>fill</w:t>
-            </w:r>
-            <w:proofErr w:type="gramEnd"/>
-            <w:r>
-              <w:rPr>
-                <w:rFonts w:ascii="Times New Roman" w:hAnsi="Times New Roman" w:cs="Times New Roman"/>
-                <w:sz w:val="24"/>
-                <w:szCs w:val="24"/>
-              </w:rPr>
-              <w:t xml:space="preserve"> invalid way if available; otherwise replace LRU way. Return fetched data.</w:t>
+              <w:t>Enter MEM_READ, fetch from memory, fill invalid way if available; otherwise replace LRU way. Return fetched data.</w:t>
             </w:r>
           </w:p>
         </w:tc>
@@ -5340,25 +5147,7 @@
                 <w:sz w:val="24"/>
                 <w:szCs w:val="24"/>
               </w:rPr>
-              <w:t xml:space="preserve">Requested tag </w:t>
-            </w:r>
-            <w:proofErr w:type="gramStart"/>
-            <w:r>
-              <w:rPr>
-                <w:rFonts w:ascii="Times New Roman" w:hAnsi="Times New Roman" w:cs="Times New Roman"/>
-                <w:sz w:val="24"/>
-                <w:szCs w:val="24"/>
-              </w:rPr>
-              <w:t>matches</w:t>
-            </w:r>
-            <w:proofErr w:type="gramEnd"/>
-            <w:r>
-              <w:rPr>
-                <w:rFonts w:ascii="Times New Roman" w:hAnsi="Times New Roman" w:cs="Times New Roman"/>
-                <w:sz w:val="24"/>
-                <w:szCs w:val="24"/>
-              </w:rPr>
-              <w:t xml:space="preserve"> a valid way.</w:t>
+              <w:t>Requested tag matches a valid way.</w:t>
             </w:r>
           </w:p>
         </w:tc>
@@ -5459,25 +5248,7 @@
                 <w:sz w:val="24"/>
                 <w:szCs w:val="24"/>
               </w:rPr>
-              <w:t xml:space="preserve">Do not allocate </w:t>
-            </w:r>
-            <w:proofErr w:type="gramStart"/>
-            <w:r>
-              <w:rPr>
-                <w:rFonts w:ascii="Times New Roman" w:hAnsi="Times New Roman" w:cs="Times New Roman"/>
-                <w:sz w:val="24"/>
-                <w:szCs w:val="24"/>
-              </w:rPr>
-              <w:t>cache</w:t>
-            </w:r>
-            <w:proofErr w:type="gramEnd"/>
-            <w:r>
-              <w:rPr>
-                <w:rFonts w:ascii="Times New Roman" w:hAnsi="Times New Roman" w:cs="Times New Roman"/>
-                <w:sz w:val="24"/>
-                <w:szCs w:val="24"/>
-              </w:rPr>
-              <w:t>. Enter MEM_WRITE and write directly to main memory.</w:t>
+              <w:t>Do not allocate cache. Enter MEM_WRITE and write directly to main memory.</w:t>
             </w:r>
           </w:p>
         </w:tc>
@@ -5552,27 +5323,11 @@
         <w:jc w:val="center"/>
       </w:pPr>
       <w:r>
-        <w:t xml:space="preserve">lru_way[set] = </w:t>
-      </w:r>
-      <w:proofErr w:type="gramStart"/>
-      <w:r>
-        <w:t>0  -</w:t>
-      </w:r>
-      <w:proofErr w:type="gramEnd"/>
-      <w:r>
-        <w:t>&gt; Way 0 is the replacement victim</w:t>
+        <w:t>lru_way[set] = 0  -&gt; Way 0 is the replacement victim</w:t>
       </w:r>
       <w:r>
         <w:br/>
-        <w:t xml:space="preserve">lru_way[set] = </w:t>
-      </w:r>
-      <w:proofErr w:type="gramStart"/>
-      <w:r>
-        <w:t>1  -</w:t>
-      </w:r>
-      <w:proofErr w:type="gramEnd"/>
-      <w:r>
-        <w:t>&gt; Way 1 is the replacement victim</w:t>
+        <w:t>lru_way[set] = 1  -&gt; Way 1 is the replacement victim</w:t>
       </w:r>
     </w:p>
     <w:p>
@@ -5625,25 +5380,7 @@
           <w:sz w:val="24"/>
           <w:szCs w:val="24"/>
         </w:rPr>
-        <w:t xml:space="preserve">Every CPU write eventually enters MEM_WRITE. While the FSM is in MEM_WRITE, mem_req=1 and mem_we=1. A write hit updates the cached copy first; a write miss leaves the cache unchanged. In both cases, main memory receives </w:t>
-      </w:r>
-      <w:proofErr w:type="gramStart"/>
-      <w:r>
-        <w:rPr>
-          <w:rFonts w:ascii="Times New Roman" w:hAnsi="Times New Roman" w:cs="Times New Roman"/>
-          <w:sz w:val="24"/>
-          <w:szCs w:val="24"/>
-        </w:rPr>
-        <w:t>the new</w:t>
-      </w:r>
-      <w:proofErr w:type="gramEnd"/>
-      <w:r>
-        <w:rPr>
-          <w:rFonts w:ascii="Times New Roman" w:hAnsi="Times New Roman" w:cs="Times New Roman"/>
-          <w:sz w:val="24"/>
-          <w:szCs w:val="24"/>
-        </w:rPr>
-        <w:t xml:space="preserve"> value.</w:t>
+        <w:t>Every CPU write eventually enters MEM_WRITE. While the FSM is in MEM_WRITE, mem_req=1 and mem_we=1. A write hit updates the cached copy first; a write miss leaves the cache unchanged. In both cases, main memory receives the new value.</w:t>
       </w:r>
     </w:p>
     <w:p>
@@ -5766,23 +5503,7 @@
         <w:jc w:val="center"/>
       </w:pPr>
       <w:r>
-        <w:t>reg [13:0] tag_way</w:t>
-      </w:r>
-      <w:proofErr w:type="gramStart"/>
-      <w:r>
-        <w:t>0  [</w:t>
-      </w:r>
-      <w:proofErr w:type="gramEnd"/>
-      <w:r>
-        <w:t>0:3], tag_way</w:t>
-      </w:r>
-      <w:proofErr w:type="gramStart"/>
-      <w:r>
-        <w:t>1  [</w:t>
-      </w:r>
-      <w:proofErr w:type="gramEnd"/>
-      <w:r>
-        <w:t>0:3];</w:t>
+        <w:t>reg [13:0] tag_way0  [0:3], tag_way1  [0:3];</w:t>
       </w:r>
       <w:r>
         <w:br/>
@@ -5806,15 +5527,7 @@
       </w:r>
       <w:proofErr w:type="spellEnd"/>
       <w:r>
-        <w:t xml:space="preserve"> </w:t>
-      </w:r>
-      <w:proofErr w:type="gramStart"/>
-      <w:r>
-        <w:t xml:space="preserve">   [</w:t>
-      </w:r>
-      <w:proofErr w:type="gramEnd"/>
-      <w:r>
-        <w:t>0:3];</w:t>
+        <w:t xml:space="preserve">    [0:3];</w:t>
       </w:r>
     </w:p>
     <w:p>
@@ -5848,25 +5561,7 @@
           <w:sz w:val="24"/>
           <w:szCs w:val="24"/>
         </w:rPr>
-        <w:t xml:space="preserve"> implementation uses separate Way-0 and Way-1 memories for tag, data, and valid information, with four entries in each way. On reset, both valid memories are </w:t>
-      </w:r>
-      <w:proofErr w:type="gramStart"/>
-      <w:r>
-        <w:rPr>
-          <w:rFonts w:ascii="Times New Roman" w:hAnsi="Times New Roman" w:cs="Times New Roman"/>
-          <w:sz w:val="24"/>
-          <w:szCs w:val="24"/>
-        </w:rPr>
-        <w:t>cleared</w:t>
-      </w:r>
-      <w:proofErr w:type="gramEnd"/>
-      <w:r>
-        <w:rPr>
-          <w:rFonts w:ascii="Times New Roman" w:hAnsi="Times New Roman" w:cs="Times New Roman"/>
-          <w:sz w:val="24"/>
-          <w:szCs w:val="24"/>
-        </w:rPr>
-        <w:t xml:space="preserve"> and each LRU bit is initialized.</w:t>
+        <w:t xml:space="preserve"> implementation uses separate Way-0 and Way-1 memories for tag, data, and valid information, with four entries in each way. On reset, both valid memories are cleared and each LRU bit is initialized.</w:t>
       </w:r>
     </w:p>
     <w:p>
@@ -5944,19 +5639,11 @@
       </w:r>
       <w:proofErr w:type="spellStart"/>
       <w:r>
-        <w:t>req_</w:t>
-      </w:r>
-      <w:proofErr w:type="gramStart"/>
-      <w:r>
-        <w:t>addr</w:t>
+        <w:t>req_addr</w:t>
       </w:r>
       <w:proofErr w:type="spellEnd"/>
       <w:r>
-        <w:t>[</w:t>
-      </w:r>
-      <w:proofErr w:type="gramEnd"/>
-      <w:r>
-        <w:t>1:0];</w:t>
+        <w:t>[1:0];</w:t>
       </w:r>
       <w:r>
         <w:br/>
@@ -5972,31 +5659,15 @@
       </w:r>
       <w:proofErr w:type="spellStart"/>
       <w:r>
-        <w:t>req_</w:t>
-      </w:r>
-      <w:proofErr w:type="gramStart"/>
-      <w:r>
-        <w:t>addr</w:t>
+        <w:t>req_addr</w:t>
       </w:r>
       <w:proofErr w:type="spellEnd"/>
       <w:r>
-        <w:t>[</w:t>
-      </w:r>
-      <w:proofErr w:type="gramEnd"/>
-      <w:r>
-        <w:t>15:2];</w:t>
+        <w:t>[15:2];</w:t>
       </w:r>
       <w:r>
         <w:br/>
-        <w:t>assign hit_way</w:t>
-      </w:r>
-      <w:proofErr w:type="gramStart"/>
-      <w:r>
-        <w:t>0  =</w:t>
-      </w:r>
-      <w:proofErr w:type="gramEnd"/>
-      <w:r>
-        <w:t xml:space="preserve"> valid_way0[</w:t>
+        <w:t>assign hit_way0  = valid_way0[</w:t>
       </w:r>
       <w:proofErr w:type="spellStart"/>
       <w:r>
@@ -6024,15 +5695,7 @@
       </w:r>
       <w:r>
         <w:br/>
-        <w:t>assign hit_way</w:t>
-      </w:r>
-      <w:proofErr w:type="gramStart"/>
-      <w:r>
-        <w:t>1  =</w:t>
-      </w:r>
-      <w:proofErr w:type="gramEnd"/>
-      <w:r>
-        <w:t xml:space="preserve"> valid_way1[</w:t>
+        <w:t>assign hit_way1  = valid_way1[</w:t>
       </w:r>
       <w:proofErr w:type="spellStart"/>
       <w:r>
@@ -6359,25 +6022,7 @@
           <w:sz w:val="24"/>
           <w:szCs w:val="24"/>
         </w:rPr>
-        <w:t xml:space="preserve">read_test(...) task for </w:t>
-      </w:r>
-      <w:proofErr w:type="gramStart"/>
-      <w:r>
-        <w:rPr>
-          <w:rFonts w:ascii="Times New Roman" w:hAnsi="Times New Roman" w:cs="Times New Roman"/>
-          <w:sz w:val="24"/>
-          <w:szCs w:val="24"/>
-        </w:rPr>
-        <w:t>read</w:t>
-      </w:r>
-      <w:proofErr w:type="gramEnd"/>
-      <w:r>
-        <w:rPr>
-          <w:rFonts w:ascii="Times New Roman" w:hAnsi="Times New Roman" w:cs="Times New Roman"/>
-          <w:sz w:val="24"/>
-          <w:szCs w:val="24"/>
-        </w:rPr>
-        <w:t xml:space="preserve"> hit/miss checking and returned-data verification.</w:t>
+        <w:t>read_test(...) task for read hit/miss checking and returned-data verification.</w:t>
       </w:r>
     </w:p>
     <w:p>
@@ -6423,43 +6068,7 @@
           <w:sz w:val="24"/>
           <w:szCs w:val="24"/>
         </w:rPr>
-        <w:t>test_</w:t>
-      </w:r>
-      <w:proofErr w:type="gramStart"/>
-      <w:r>
-        <w:rPr>
-          <w:rFonts w:ascii="Times New Roman" w:hAnsi="Times New Roman" w:cs="Times New Roman"/>
-          <w:sz w:val="24"/>
-          <w:szCs w:val="24"/>
-        </w:rPr>
-        <w:t>pass[</w:t>
-      </w:r>
-      <w:proofErr w:type="gramEnd"/>
-      <w:r>
-        <w:rPr>
-          <w:rFonts w:ascii="Times New Roman" w:hAnsi="Times New Roman" w:cs="Times New Roman"/>
-          <w:sz w:val="24"/>
-          <w:szCs w:val="24"/>
-        </w:rPr>
-        <w:t>1:15] array and print_</w:t>
-      </w:r>
-      <w:proofErr w:type="gramStart"/>
-      <w:r>
-        <w:rPr>
-          <w:rFonts w:ascii="Times New Roman" w:hAnsi="Times New Roman" w:cs="Times New Roman"/>
-          <w:sz w:val="24"/>
-          <w:szCs w:val="24"/>
-        </w:rPr>
-        <w:t>summary(</w:t>
-      </w:r>
-      <w:proofErr w:type="gramEnd"/>
-      <w:r>
-        <w:rPr>
-          <w:rFonts w:ascii="Times New Roman" w:hAnsi="Times New Roman" w:cs="Times New Roman"/>
-          <w:sz w:val="24"/>
-          <w:szCs w:val="24"/>
-        </w:rPr>
-        <w:t>) task for a compact final report.</w:t>
+        <w:t>test_pass[1:15] array and print_summary() task for a compact final report.</w:t>
       </w:r>
     </w:p>
     <w:p>
@@ -6621,16 +6230,16 @@
           <w:noProof/>
         </w:rPr>
         <w:drawing>
-          <wp:anchor distT="0" distB="0" distL="114300" distR="114300" simplePos="0" relativeHeight="251658240" behindDoc="0" locked="0" layoutInCell="1" allowOverlap="1" wp14:anchorId="45764624" wp14:editId="7FEC17F2">
+          <wp:anchor distT="0" distB="0" distL="114300" distR="114300" simplePos="0" relativeHeight="251658240" behindDoc="0" locked="0" layoutInCell="1" allowOverlap="1" wp14:anchorId="45764624" wp14:editId="7FE1735F">
             <wp:simplePos x="0" y="0"/>
-            <wp:positionH relativeFrom="column">
-              <wp:posOffset>207645</wp:posOffset>
+            <wp:positionH relativeFrom="margin">
+              <wp:align>left</wp:align>
             </wp:positionH>
             <wp:positionV relativeFrom="paragraph">
-              <wp:posOffset>154305</wp:posOffset>
+              <wp:posOffset>183176</wp:posOffset>
             </wp:positionV>
-            <wp:extent cx="6033135" cy="2655570"/>
-            <wp:effectExtent l="171450" t="171450" r="386715" b="373380"/>
+            <wp:extent cx="6238227" cy="2908917"/>
+            <wp:effectExtent l="171450" t="171450" r="372745" b="387350"/>
             <wp:wrapNone/>
             <wp:docPr id="3" name="Picture 3"/>
             <wp:cNvGraphicFramePr>
@@ -6652,7 +6261,7 @@
                   <pic:spPr>
                     <a:xfrm>
                       <a:off x="0" y="0"/>
-                      <a:ext cx="6033135" cy="2655570"/>
+                      <a:ext cx="6238227" cy="2908917"/>
                     </a:xfrm>
                     <a:prstGeom prst="rect">
                       <a:avLst/>
@@ -6673,6 +6282,12 @@
                 </pic:pic>
               </a:graphicData>
             </a:graphic>
+            <wp14:sizeRelH relativeFrom="margin">
+              <wp14:pctWidth>0</wp14:pctWidth>
+            </wp14:sizeRelH>
+            <wp14:sizeRelV relativeFrom="margin">
+              <wp14:pctHeight>0</wp14:pctHeight>
+            </wp14:sizeRelV>
           </wp:anchor>
         </w:drawing>
       </w:r>
@@ -6810,14 +6425,42 @@
     <w:p>
       <w:pPr>
         <w:jc w:val="center"/>
-      </w:pPr>
-      <w:r>
         <w:rPr>
           <w:rFonts w:ascii="Times New Roman" w:hAnsi="Times New Roman"/>
           <w:i/>
           <w:sz w:val="22"/>
         </w:rPr>
+      </w:pPr>
+    </w:p>
+    <w:p>
+      <w:pPr>
+        <w:jc w:val="center"/>
+        <w:rPr>
+          <w:rFonts w:ascii="Times New Roman" w:hAnsi="Times New Roman"/>
+          <w:i/>
+          <w:sz w:val="22"/>
+        </w:rPr>
+      </w:pPr>
+    </w:p>
+    <w:p>
+      <w:pPr>
+        <w:jc w:val="center"/>
+      </w:pPr>
+      <w:r>
+        <w:rPr>
+          <w:rFonts w:ascii="Times New Roman" w:hAnsi="Times New Roman"/>
+          <w:i/>
+          <w:sz w:val="22"/>
+        </w:rPr>
         <w:t>Figure 3. EPWave simulation output showing CPU, cache, memory, and FSM-state activity for the directed Verilog testbench.</w:t>
+      </w:r>
+      <w:r>
+        <w:rPr>
+          <w:rFonts w:ascii="Times New Roman" w:hAnsi="Times New Roman"/>
+          <w:i/>
+          <w:sz w:val="22"/>
+        </w:rPr>
+        <w:br/>
       </w:r>
     </w:p>
     <w:p>
@@ -6840,6 +6483,7 @@
           <w:highlight w:val="lightGray"/>
           <w:u w:val="single"/>
         </w:rPr>
+        <w:lastRenderedPageBreak/>
         <w:t>9. DIRECTED TEST PLAN</w:t>
       </w:r>
       <w:bookmarkEnd w:id="52"/>
@@ -6859,25 +6503,7 @@
           <w:sz w:val="24"/>
           <w:szCs w:val="24"/>
         </w:rPr>
-        <w:t xml:space="preserve">The current </w:t>
-      </w:r>
-      <w:proofErr w:type="gramStart"/>
-      <w:r>
-        <w:rPr>
-          <w:rFonts w:ascii="Times New Roman" w:hAnsi="Times New Roman" w:cs="Times New Roman"/>
-          <w:sz w:val="24"/>
-          <w:szCs w:val="24"/>
-        </w:rPr>
-        <w:t>testbench</w:t>
-      </w:r>
-      <w:proofErr w:type="gramEnd"/>
-      <w:r>
-        <w:rPr>
-          <w:rFonts w:ascii="Times New Roman" w:hAnsi="Times New Roman" w:cs="Times New Roman"/>
-          <w:sz w:val="24"/>
-          <w:szCs w:val="24"/>
-        </w:rPr>
-        <w:t xml:space="preserve"> contains 15 directed tests. The sequence is intentionally ordered so that earlier accesses establish the cache state needed by later LRU and write-policy tests.</w:t>
+        <w:t>The current testbench contains 15 directed tests. The sequence is intentionally ordered so that earlier accesses establish the cache state needed by later LRU and write-policy tests.</w:t>
       </w:r>
     </w:p>
     <w:p>
@@ -8331,25 +7957,7 @@
                 <w:sz w:val="24"/>
                 <w:szCs w:val="24"/>
               </w:rPr>
-              <w:t>Memory only; repeated no-write-</w:t>
-            </w:r>
-            <w:proofErr w:type="gramStart"/>
-            <w:r>
-              <w:rPr>
-                <w:rFonts w:ascii="Times New Roman" w:hAnsi="Times New Roman" w:cs="Times New Roman"/>
-                <w:sz w:val="24"/>
-                <w:szCs w:val="24"/>
-              </w:rPr>
-              <w:t>allocate</w:t>
-            </w:r>
-            <w:proofErr w:type="gramEnd"/>
-            <w:r>
-              <w:rPr>
-                <w:rFonts w:ascii="Times New Roman" w:hAnsi="Times New Roman" w:cs="Times New Roman"/>
-                <w:sz w:val="24"/>
-                <w:szCs w:val="24"/>
-              </w:rPr>
-              <w:t xml:space="preserve"> behavior.</w:t>
+              <w:t>Memory only; repeated no-write-allocate behavior.</w:t>
             </w:r>
           </w:p>
         </w:tc>
@@ -8636,25 +8244,7 @@
           <w:sz w:val="24"/>
           <w:szCs w:val="24"/>
         </w:rPr>
-        <w:t xml:space="preserve">When the testbench is executed, each test prints the address, index, tag, way-hit information, memory activity, operation type, returned or written data, and a PASS/FAIL result. The final summary </w:t>
-      </w:r>
-      <w:proofErr w:type="gramStart"/>
-      <w:r>
-        <w:rPr>
-          <w:rFonts w:ascii="Times New Roman" w:hAnsi="Times New Roman" w:cs="Times New Roman"/>
-          <w:sz w:val="24"/>
-          <w:szCs w:val="24"/>
-        </w:rPr>
-        <w:t>reports</w:t>
-      </w:r>
-      <w:proofErr w:type="gramEnd"/>
-      <w:r>
-        <w:rPr>
-          <w:rFonts w:ascii="Times New Roman" w:hAnsi="Times New Roman" w:cs="Times New Roman"/>
-          <w:sz w:val="24"/>
-          <w:szCs w:val="24"/>
-        </w:rPr>
-        <w:t xml:space="preserve"> the status of all 15 directed tests.</w:t>
+        <w:t>When the testbench is executed, each test prints the address, index, tag, way-hit information, memory activity, operation type, returned or written data, and a PASS/FAIL result. The final summary reports the status of all 15 directed tests.</w:t>
       </w:r>
     </w:p>
     <w:p>

</xml_diff>